<commit_message>
Add contest brief, written description draft, and video assets
- CargoFlow_Sentinel_Brief.pdf: designed one-pager explaining the problem,
  solution, industry fit, business value, and evaluation results
- Written_Description_Draft.md: draft for the contest's written description
  requirement, including target-business fit criteria and qualifying
  questions
- video_assets_conversation_card.png: title card for the video's opening
  conversation beat
- CargoFlow_Sentinel_Requirement_Plan.docx: SS's own edits
- architecture_diagram.png: SS's own addition

Co-Authored-By: Claude Sonnet 5 <noreply@anthropic.com>
</commit_message>
<xml_diff>
--- a/docs/CargoFlow_Sentinel_Requirement_Plan.docx
+++ b/docs/CargoFlow_Sentinel_Requirement_Plan.docx
@@ -235,12 +235,70 @@
       </w:r>
     </w:p>
     <w:p>
+      <w:r>
+        <w:rPr>
+          <w:b/>
+          <w:sz w:val="22"/>
+        </w:rPr>
+        <w:t>Figure 1 — Agent architecture and conditional escalation flow</w:t>
+      </w:r>
+    </w:p>
+    <w:p>
+      <w:pPr>
+        <w:jc w:val="center"/>
+      </w:pPr>
+      <w:r>
+        <w:drawing>
+          <wp:inline xmlns:a="http://schemas.openxmlformats.org/drawingml/2006/main" xmlns:pic="http://schemas.openxmlformats.org/drawingml/2006/picture">
+            <wp:extent cx="5760720" cy="3367806"/>
+            <wp:docPr id="1" name="Picture 1"/>
+            <wp:cNvGraphicFramePr>
+              <a:graphicFrameLocks noChangeAspect="1"/>
+            </wp:cNvGraphicFramePr>
+            <a:graphic>
+              <a:graphicData uri="http://schemas.openxmlformats.org/drawingml/2006/picture">
+                <pic:pic>
+                  <pic:nvPicPr>
+                    <pic:cNvPr id="0" name="architecture_diagram.png"/>
+                    <pic:cNvPicPr/>
+                  </pic:nvPicPr>
+                  <pic:blipFill>
+                    <a:blip r:embed="rId8"/>
+                    <a:stretch>
+                      <a:fillRect/>
+                    </a:stretch>
+                  </pic:blipFill>
+                  <pic:spPr>
+                    <a:xfrm>
+                      <a:off x="0" y="0"/>
+                      <a:ext cx="5760720" cy="3367806"/>
+                    </a:xfrm>
+                    <a:prstGeom prst="rect"/>
+                  </pic:spPr>
+                </pic:pic>
+              </a:graphicData>
+            </a:graphic>
+          </wp:inline>
+        </w:drawing>
+      </w:r>
+    </w:p>
+    <w:p>
+      <w:r>
+        <w:rPr>
+          <w:i/>
+          <w:sz w:val="18"/>
+        </w:rPr>
+        <w:t>Solid arrows: sequential handoff. Red: the conditional Critical-only branch to the ERP Reconciliation Agent. Dashed grey: Normal shipments bypass Agents 2 and 3 entirely. Dashed gold: distributed tracing captured for every agent turn.</w:t>
+      </w:r>
+    </w:p>
+    <w:p/>
+    <w:p>
       <w:pPr>
         <w:pStyle w:val="Heading1"/>
         <w:spacing w:after="160" w:before="320"/>
       </w:pPr>
       <w:r>
-        <w:t xml:space="preserve">3. A Simple Example</w:t>
+        <w:t xml:space="preserve">3. Workflow Design</w:t>
       </w:r>
     </w:p>
     <w:p>
@@ -248,85 +306,147 @@
         <w:spacing w:after="160"/>
       </w:pPr>
       <w:r>
-        <w:t xml:space="preserve">To make this concrete, here is what happens to one shipment, in plain terms, with no technical jargon.</w:t>
-      </w:r>
-    </w:p>
-    <w:p>
-      <w:pPr>
-        <w:pStyle w:val="ListParagraph"/>
-        <w:numPr>
-          <w:ilvl w:val="0"/>
-          <w:numId w:val="2"/>
-        </w:numPr>
-        <w:spacing w:after="80"/>
-      </w:pPr>
-      <w:r>
-        <w:t xml:space="preserve">A refrigerated shipment of pharmaceutical stock is en route from Rotterdam to Warsaw. It is linked to a purchase order for a manufacturing customer whose production line depends on this delivery.</w:t>
-      </w:r>
-    </w:p>
-    <w:p>
-      <w:pPr>
-        <w:pStyle w:val="ListParagraph"/>
-        <w:numPr>
-          <w:ilvl w:val="0"/>
-          <w:numId w:val="2"/>
-        </w:numPr>
-        <w:spacing w:after="80"/>
-      </w:pPr>
-      <w:r>
-        <w:t xml:space="preserve">Partway through the journey, the shipment sits at customs far longer than expected, and the temperature log shows the cargo has crept above its safe limit.</w:t>
-      </w:r>
-    </w:p>
-    <w:p>
-      <w:pPr>
-        <w:pStyle w:val="ListParagraph"/>
-        <w:numPr>
-          <w:ilvl w:val="0"/>
-          <w:numId w:val="2"/>
-        </w:numPr>
-        <w:spacing w:after="80"/>
-      </w:pPr>
-      <w:r>
-        <w:t xml:space="preserve">The first agent notices both problems immediately — not at the end of the day when someone checks a spreadsheet, but as soon as the readings come in — and marks the shipment Critical.</w:t>
-      </w:r>
-    </w:p>
-    <w:p>
-      <w:pPr>
-        <w:pStyle w:val="ListParagraph"/>
-        <w:numPr>
-          <w:ilvl w:val="0"/>
-          <w:numId w:val="2"/>
-        </w:numPr>
-        <w:spacing w:after="80"/>
-      </w:pPr>
-      <w:r>
-        <w:t xml:space="preserve">The second agent looks at what went wrong and concludes: this looks like a customs hold combined with a refrigeration unit fault, and recommends contacting the carrier's dispatch team and flagging the cargo for inspection on arrival.</w:t>
-      </w:r>
-    </w:p>
-    <w:p>
-      <w:pPr>
-        <w:pStyle w:val="ListParagraph"/>
-        <w:numPr>
-          <w:ilvl w:val="0"/>
-          <w:numId w:val="2"/>
-        </w:numPr>
-        <w:spacing w:after="80"/>
-      </w:pPr>
-      <w:r>
-        <w:t xml:space="preserve">Because the shipment is Critical, the third agent then checks: which customer is this for, how much is the order worth, and does it feed a production line. It finds this order is tied to a €59,000 contract and that the customer's factory line depends on it — and raises this as an urgent case, not a routine one.</w:t>
-      </w:r>
-    </w:p>
-    <w:p>
-      <w:pPr>
-        <w:pStyle w:val="ListParagraph"/>
-        <w:numPr>
-          <w:ilvl w:val="0"/>
-          <w:numId w:val="2"/>
-        </w:numPr>
-        <w:spacing w:after="80"/>
-      </w:pPr>
-      <w:r>
-        <w:t xml:space="preserve">A human coordinator, instead of discovering this hours later buried in a routine status report, sees an immediate, prioritized alert: what happened, why, what to do, and how much is at stake — while there is still time to act.</w:t>
+        <w:t xml:space="preserve">This section describes how the three agents collaborate end to end to deliver a single business outcome: a consolidated shipment health assessment with a business-impact statement attached to any critical case.</w:t>
+      </w:r>
+    </w:p>
+    <w:p>
+      <w:pPr>
+        <w:pStyle w:val="Heading2"/>
+        <w:spacing w:after="120" w:before="240"/>
+      </w:pPr>
+      <w:r>
+        <w:t xml:space="preserve">3.1 Sequence of agent interactions</w:t>
+      </w:r>
+    </w:p>
+    <w:p>
+      <w:pPr>
+        <w:pStyle w:val="ListParagraph"/>
+        <w:numPr>
+          <w:ilvl w:val="0"/>
+          <w:numId w:val="2"/>
+        </w:numPr>
+        <w:spacing w:after="80"/>
+      </w:pPr>
+      <w:r>
+        <w:t xml:space="preserve">The Exception Detection Agent runs first, against every shipment in the current batch.</w:t>
+      </w:r>
+    </w:p>
+    <w:p>
+      <w:pPr>
+        <w:pStyle w:val="ListParagraph"/>
+        <w:numPr>
+          <w:ilvl w:val="0"/>
+          <w:numId w:val="2"/>
+        </w:numPr>
+        <w:spacing w:after="80"/>
+      </w:pPr>
+      <w:r>
+        <w:t xml:space="preserve">For any shipment classified Warning or Critical, its output is passed to the Root-Cause &amp; Action Agent.</w:t>
+      </w:r>
+    </w:p>
+    <w:p>
+      <w:pPr>
+        <w:pStyle w:val="ListParagraph"/>
+        <w:numPr>
+          <w:ilvl w:val="0"/>
+          <w:numId w:val="2"/>
+        </w:numPr>
+        <w:spacing w:after="80"/>
+      </w:pPr>
+      <w:r>
+        <w:t xml:space="preserve">For any shipment classified Critical specifically, the Root-Cause &amp; Action Agent's output is passed onward to the ERP Reconciliation Agent. Normal and Warning shipments do not reach this third step.</w:t>
+      </w:r>
+    </w:p>
+    <w:p>
+      <w:pPr>
+        <w:pStyle w:val="Heading2"/>
+        <w:spacing w:after="120" w:before="240"/>
+      </w:pPr>
+      <w:r>
+        <w:t xml:space="preserve">3.2 Information passed between agents</w:t>
+      </w:r>
+    </w:p>
+    <w:p>
+      <w:pPr>
+        <w:pStyle w:val="ListParagraph"/>
+        <w:numPr>
+          <w:ilvl w:val="0"/>
+          <w:numId w:val="2"/>
+        </w:numPr>
+        <w:spacing w:after="80"/>
+      </w:pPr>
+      <w:r>
+        <w:t xml:space="preserve">Detection → Diagnosis: shipment ID, route, carrier, the specific out-of-spec readings and their severity.</w:t>
+      </w:r>
+    </w:p>
+    <w:p>
+      <w:pPr>
+        <w:pStyle w:val="ListParagraph"/>
+        <w:numPr>
+          <w:ilvl w:val="0"/>
+          <w:numId w:val="2"/>
+        </w:numPr>
+        <w:spacing w:after="80"/>
+      </w:pPr>
+      <w:r>
+        <w:t xml:space="preserve">Diagnosis → Reconciliation: shipment ID and severity only — the reconciliation step re-fetches business data independently rather than trusting a forwarded summary, so its financial figures always come from the source system, not from another agent's interpretation.</w:t>
+      </w:r>
+    </w:p>
+    <w:p>
+      <w:pPr>
+        <w:pStyle w:val="Heading2"/>
+        <w:spacing w:after="120" w:before="240"/>
+      </w:pPr>
+      <w:r>
+        <w:t xml:space="preserve">3.3 Tool calls and knowledge retrieval</w:t>
+      </w:r>
+    </w:p>
+    <w:p>
+      <w:pPr>
+        <w:pStyle w:val="ListParagraph"/>
+        <w:numPr>
+          <w:ilvl w:val="0"/>
+          <w:numId w:val="2"/>
+        </w:numPr>
+        <w:spacing w:after="80"/>
+      </w:pPr>
+      <w:r>
+        <w:t xml:space="preserve">check_shipment_health: reads shipment milestone and temperature data and compares it against defined thresholds. Used by the Exception Detection Agent.</w:t>
+      </w:r>
+    </w:p>
+    <w:p>
+      <w:pPr>
+        <w:pStyle w:val="ListParagraph"/>
+        <w:numPr>
+          <w:ilvl w:val="0"/>
+          <w:numId w:val="2"/>
+        </w:numPr>
+        <w:spacing w:after="80"/>
+      </w:pPr>
+      <w:r>
+        <w:t xml:space="preserve">check_po_impact: looks up the purchase order linked to a shipment and returns customer, order value, and production dependency. Used only by the ERP Reconciliation Agent, and only when invoked.</w:t>
+      </w:r>
+    </w:p>
+    <w:p>
+      <w:pPr>
+        <w:pStyle w:val="ListParagraph"/>
+        <w:numPr>
+          <w:ilvl w:val="0"/>
+          <w:numId w:val="2"/>
+        </w:numPr>
+        <w:spacing w:after="80"/>
+      </w:pPr>
+      <w:r>
+        <w:t xml:space="preserve">Both tools are deliberately narrow, single-purpose functions rather than a general-purpose data access layer — this keeps each agent's grounding data auditable and easy to reason about.</w:t>
+      </w:r>
+    </w:p>
+    <w:p>
+      <w:pPr>
+        <w:pStyle w:val="Heading2"/>
+        <w:spacing w:after="120" w:before="240"/>
+      </w:pPr>
+      <w:r>
+        <w:t xml:space="preserve">3.4 Final output</w:t>
       </w:r>
     </w:p>
     <w:p>
@@ -334,7 +454,68 @@
         <w:spacing w:after="160"/>
       </w:pPr>
       <w:r>
-        <w:t xml:space="preserve">That is the entire system, end to end: notice quickly, explain why, and tell a human how much it matters — automatically, and only escalating the cases that genuinely need a person's judgment.</w:t>
+        <w:t xml:space="preserve">A consolidated report: total shipments checked, counts by severity, a diagnosis and recommended action for every Warning or Critical shipment, and a business-impact statement (customer, order value, production dependency) for every Critical shipment. This is the artefact a logistics coordinator would actually read.</w:t>
+      </w:r>
+    </w:p>
+    <w:p>
+      <w:pPr>
+        <w:pStyle w:val="Heading2"/>
+        <w:spacing w:after="120" w:before="240"/>
+      </w:pPr>
+      <w:r>
+        <w:t xml:space="preserve">3.5 Deployment, monitoring, evaluation, and improvement over time</w:t>
+      </w:r>
+    </w:p>
+    <w:p>
+      <w:pPr>
+        <w:pStyle w:val="ListParagraph"/>
+        <w:numPr>
+          <w:ilvl w:val="0"/>
+          <w:numId w:val="2"/>
+        </w:numPr>
+        <w:spacing w:after="80"/>
+      </w:pPr>
+      <w:r>
+        <w:t xml:space="preserve">Deployment: each agent is a persistent, versioned resource in Microsoft Foundry, invocable by name via the Responses API — not a script that runs once and disappears.</w:t>
+      </w:r>
+    </w:p>
+    <w:p>
+      <w:pPr>
+        <w:pStyle w:val="ListParagraph"/>
+        <w:numPr>
+          <w:ilvl w:val="0"/>
+          <w:numId w:val="2"/>
+        </w:numPr>
+        <w:spacing w:after="80"/>
+      </w:pPr>
+      <w:r>
+        <w:t xml:space="preserve">Monitoring: see Section 4 (Observability Strategy).</w:t>
+      </w:r>
+    </w:p>
+    <w:p>
+      <w:pPr>
+        <w:pStyle w:val="ListParagraph"/>
+        <w:numPr>
+          <w:ilvl w:val="0"/>
+          <w:numId w:val="2"/>
+        </w:numPr>
+        <w:spacing w:after="80"/>
+      </w:pPr>
+      <w:r>
+        <w:t xml:space="preserve">Evaluation: see Section 5 (Evaluation Approach).</w:t>
+      </w:r>
+    </w:p>
+    <w:p>
+      <w:pPr>
+        <w:pStyle w:val="ListParagraph"/>
+        <w:numPr>
+          <w:ilvl w:val="0"/>
+          <w:numId w:val="2"/>
+        </w:numPr>
+        <w:spacing w:after="80"/>
+      </w:pPr>
+      <w:r>
+        <w:t xml:space="preserve">Improvement over time: see Section 13 (Scope to Enhance This Solution), which covers the outcome-based feedback loop, live ERP integration, and write-back alerting as concrete next steps.</w:t>
       </w:r>
     </w:p>
     <w:p>
@@ -343,7 +524,394 @@
         <w:spacing w:after="160" w:before="320"/>
       </w:pPr>
       <w:r>
-        <w:t xml:space="preserve">4. D365 Finance &amp; Operations / Retail Integration</w:t>
+        <w:t xml:space="preserve">4. Observability Strategy</w:t>
+      </w:r>
+    </w:p>
+    <w:p>
+      <w:pPr>
+        <w:spacing w:after="160"/>
+      </w:pPr>
+      <w:r>
+        <w:t xml:space="preserve">This solution was built with observability in place from the start, not added afterward — the following was implemented and verified against a live deployment, not planned in the abstract.</w:t>
+      </w:r>
+    </w:p>
+    <w:p>
+      <w:pPr>
+        <w:pStyle w:val="Heading2"/>
+        <w:spacing w:after="120" w:before="240"/>
+      </w:pPr>
+      <w:r>
+        <w:t xml:space="preserve">4.1 Traces and monitoring metrics collected</w:t>
+      </w:r>
+    </w:p>
+    <w:p>
+      <w:pPr>
+        <w:pStyle w:val="ListParagraph"/>
+        <w:numPr>
+          <w:ilvl w:val="0"/>
+          <w:numId w:val="2"/>
+        </w:numPr>
+        <w:spacing w:after="80"/>
+      </w:pPr>
+      <w:r>
+        <w:t xml:space="preserve">GenAI distributed tracing via Application Insights, capturing every agent turn as a span: the model call, any tool call and its inputs/outputs, and the final response, with token counts and latency per span.</w:t>
+      </w:r>
+    </w:p>
+    <w:p>
+      <w:pPr>
+        <w:pStyle w:val="ListParagraph"/>
+        <w:numPr>
+          <w:ilvl w:val="0"/>
+          <w:numId w:val="2"/>
+        </w:numPr>
+        <w:spacing w:after="80"/>
+      </w:pPr>
+      <w:r>
+        <w:t xml:space="preserve">Aggregate operational metrics: agent run counts, token consumption by model, input-versus-output token split, and estimated cost — available both in the Foundry portal's per-agent Monitor view and in Application Insights' Agents dashboard.</w:t>
+      </w:r>
+    </w:p>
+    <w:p>
+      <w:pPr>
+        <w:pStyle w:val="Heading2"/>
+        <w:spacing w:after="120" w:before="240"/>
+      </w:pPr>
+      <w:r>
+        <w:t xml:space="preserve">4.2 How these insights help diagnose issues and improve performance</w:t>
+      </w:r>
+    </w:p>
+    <w:p>
+      <w:pPr>
+        <w:spacing w:after="160"/>
+      </w:pPr>
+      <w:r>
+        <w:t xml:space="preserve">During development, tracing was what actually surfaced a real defect: an agent was silently attempting a tool call that could not be executed in a given context, producing an empty final response. Monitoring alone (uptime, error rate) would not have caught this — the call technically "succeeded" from a transport perspective. Only inspecting the actual trace content revealed the agent was stalled waiting on a tool result that never arrived. This is the general pattern observability is for here: catching an agent that responds confidently but incorrectly, or not at all, which uptime metrics alone cannot distinguish from a healthy agent.</w:t>
+      </w:r>
+    </w:p>
+    <w:p>
+      <w:pPr>
+        <w:pStyle w:val="Heading1"/>
+        <w:spacing w:after="160" w:before="320"/>
+      </w:pPr>
+      <w:r>
+        <w:t xml:space="preserve">5. Evaluation Approach</w:t>
+      </w:r>
+    </w:p>
+    <w:p>
+      <w:pPr>
+        <w:spacing w:after="160"/>
+      </w:pPr>
+      <w:r>
+        <w:t xml:space="preserve">Evaluation answers a different question than monitoring: not "is it running," but "is it right." This was implemented and run against a live evaluation, not left as a plan.</w:t>
+      </w:r>
+    </w:p>
+    <w:p>
+      <w:pPr>
+        <w:pStyle w:val="Heading2"/>
+        <w:spacing w:after="120" w:before="240"/>
+      </w:pPr>
+      <w:r>
+        <w:t xml:space="preserve">5.1 Evaluation dataset and testing approach</w:t>
+      </w:r>
+    </w:p>
+    <w:p>
+      <w:pPr>
+        <w:spacing w:after="160"/>
+      </w:pPr>
+      <w:r>
+        <w:t xml:space="preserve">A structured test dataset of representative scenarios, each pairing an input (shipment or machine state) with an expected classification and recommended action, run through the deployed agent, with results scored by a separate judge model — an LLM-as-judge approach, rather than manual spot-checking of a handful of responses.</w:t>
+      </w:r>
+    </w:p>
+    <w:p>
+      <w:pPr>
+        <w:pStyle w:val="Heading2"/>
+        <w:spacing w:after="120" w:before="240"/>
+      </w:pPr>
+      <w:r>
+        <w:t xml:space="preserve">5.2 Evaluation criteria selected</w:t>
+      </w:r>
+    </w:p>
+    <w:p>
+      <w:pPr>
+        <w:pStyle w:val="ListParagraph"/>
+        <w:numPr>
+          <w:ilvl w:val="0"/>
+          <w:numId w:val="2"/>
+        </w:numPr>
+        <w:spacing w:after="80"/>
+      </w:pPr>
+      <w:r>
+        <w:t>Diagnosis accuracy: whether the root-cause explanation correctly identifies the mechanism behind the flagged exception, checked by an LLM-as-judge against a list of expected concepts defined per test case (e.g. customs hold, refrigeration fault).</w:t>
+      </w:r>
+    </w:p>
+    <w:p>
+      <w:pPr>
+        <w:pStyle w:val="ListParagraph"/>
+        <w:numPr>
+          <w:ilvl w:val="0"/>
+          <w:numId w:val="2"/>
+        </w:numPr>
+        <w:spacing w:after="80"/>
+      </w:pPr>
+      <w:r>
+        <w:t>Action specificity: whether the recommended next step is concrete and immediately actionable (who to contact, what to check) rather than generic advice, scored 1-5 by the same judge pass.</w:t>
+      </w:r>
+    </w:p>
+    <w:p>
+      <w:r>
+        <w:t xml:space="preserve">This diverges deliberately from the official lab template's Coherence/Fluency pair: those two catch whether a response reads well, not whether it is actually right or useful to a coordinator, which is what this system is judged on in production. </w:t>
+      </w:r>
+      <w:r>
+        <w:t xml:space="preserve">Across the 4 test cases run against the live deployment, the average score was 4.25 / 5 (5, 5, 5, 2). </w:t>
+      </w:r>
+      <w:r>
+        <w:t>The one 2/5 case scored the ERP Reconciliation Agent's business-impact output against a rubric written for diagnostic root-cause output — it correctly reported customer, order value and production dependency, but was marked down for not repeating a root-cause diagnosis that was never its job. This is a rubric-fit gap, not an agent defect, and the fix (a separate rubric per agent role) is captured in Section 13.</w:t>
+      </w:r>
+    </w:p>
+    <w:p>
+      <w:pPr>
+        <w:spacing w:after="160"/>
+      </w:pPr>
+      <w:r>
+        <w:rPr>
+          <w:i/>
+          <w:iCs/>
+          <w:color w:val="555555"/>
+        </w:rPr>
+        <w:t xml:space="preserve">Groundedness, task adherence, safety, and tool usage were considered and are a natural extension for a production rollout, once a larger and more diverse evaluation dataset exists — see Section 13.</w:t>
+      </w:r>
+    </w:p>
+    <w:p>
+      <w:pPr>
+        <w:pStyle w:val="Heading2"/>
+        <w:spacing w:after="120" w:before="240"/>
+      </w:pPr>
+      <w:r>
+        <w:t xml:space="preserve">5.3 Integrating evaluation into the ongoing development lifecycle</w:t>
+      </w:r>
+    </w:p>
+    <w:p>
+      <w:pPr>
+        <w:pStyle w:val="ListParagraph"/>
+        <w:numPr>
+          <w:ilvl w:val="0"/>
+          <w:numId w:val="2"/>
+        </w:numPr>
+        <w:spacing w:after="80"/>
+      </w:pPr>
+      <w:r>
+        <w:t xml:space="preserve">Pre-deployment gate: run the evaluation suite before promoting a changed system prompt or model version, and require a minimum score before promotion.</w:t>
+      </w:r>
+    </w:p>
+    <w:p>
+      <w:pPr>
+        <w:pStyle w:val="ListParagraph"/>
+        <w:numPr>
+          <w:ilvl w:val="0"/>
+          <w:numId w:val="2"/>
+        </w:numPr>
+        <w:spacing w:after="80"/>
+      </w:pPr>
+      <w:r>
+        <w:t xml:space="preserve">CI/CD integration: run evaluation automatically on every change, blocking merge if quality drops below a defined threshold — the same pattern as automated testing in conventional software delivery.</w:t>
+      </w:r>
+    </w:p>
+    <w:p>
+      <w:pPr>
+        <w:pStyle w:val="ListParagraph"/>
+        <w:numPr>
+          <w:ilvl w:val="0"/>
+          <w:numId w:val="2"/>
+        </w:numPr>
+        <w:spacing w:after="80"/>
+      </w:pPr>
+      <w:r>
+        <w:t xml:space="preserve">Outcome-based feedback (see Section 13): supplementing the static evaluation dataset with real-world outcomes over time, so the evaluation set grows more representative rather than staying fixed at its original scenarios.</w:t>
+      </w:r>
+    </w:p>
+    <w:p>
+      <w:pPr>
+        <w:pStyle w:val="Heading1"/>
+        <w:spacing w:after="160" w:before="320"/>
+      </w:pPr>
+      <w:r>
+        <w:t xml:space="preserve">6. Governance and Reliability</w:t>
+      </w:r>
+    </w:p>
+    <w:p>
+      <w:pPr>
+        <w:pStyle w:val="Heading2"/>
+        <w:spacing w:after="120" w:before="240"/>
+      </w:pPr>
+      <w:r>
+        <w:t xml:space="preserve">6.1 Ensuring consistent outputs, safe behaviour, and maintainability</w:t>
+      </w:r>
+    </w:p>
+    <w:p>
+      <w:pPr>
+        <w:pStyle w:val="ListParagraph"/>
+        <w:numPr>
+          <w:ilvl w:val="0"/>
+          <w:numId w:val="2"/>
+        </w:numPr>
+        <w:spacing w:after="80"/>
+      </w:pPr>
+      <w:r>
+        <w:t xml:space="preserve">Each agent has a single, narrow responsibility (detect, diagnose, or reconcile) rather than one agent attempting all three — this makes each agent's behaviour easier to test, evaluate, and reason about in isolation.</w:t>
+      </w:r>
+    </w:p>
+    <w:p>
+      <w:pPr>
+        <w:pStyle w:val="ListParagraph"/>
+        <w:numPr>
+          <w:ilvl w:val="0"/>
+          <w:numId w:val="2"/>
+        </w:numPr>
+        <w:spacing w:after="80"/>
+      </w:pPr>
+      <w:r>
+        <w:t xml:space="preserve">System prompts were iterated specifically to remove ambiguity that caused inconsistent behaviour — for example, an early version of the detection agent's instructions allowed it to either use provided data directly or call a lookup tool, and this ambiguity caused inconsistent results across otherwise-identical inputs. The fix was to state the rule as an unambiguous fact rather than a soft condition, which produced consistent behaviour across all test cases.</w:t>
+      </w:r>
+    </w:p>
+    <w:p>
+      <w:pPr>
+        <w:pStyle w:val="ListParagraph"/>
+        <w:numPr>
+          <w:ilvl w:val="0"/>
+          <w:numId w:val="2"/>
+        </w:numPr>
+        <w:spacing w:after="80"/>
+      </w:pPr>
+      <w:r>
+        <w:t xml:space="preserve">Every agent is a versioned resource — changes produce a new version rather than silently overwriting behaviour, so a regression can always be traced to a specific change and rolled back.</w:t>
+      </w:r>
+    </w:p>
+    <w:p>
+      <w:pPr>
+        <w:pStyle w:val="Heading2"/>
+        <w:spacing w:after="120" w:before="240"/>
+      </w:pPr>
+      <w:r>
+        <w:t xml:space="preserve">6.2 How knowledge sources and tools ground agent responses</w:t>
+      </w:r>
+    </w:p>
+    <w:p>
+      <w:pPr>
+        <w:spacing w:after="160"/>
+      </w:pPr>
+      <w:r>
+        <w:t xml:space="preserve">Both the Exception Detection and ERP Reconciliation agents are grounded by narrow, purpose-built function tools (check_shipment_health, check_po_impact) rather than reasoning from general knowledge. This matters specifically for the numbers that drive a business decision — a threshold breach or an order value — which must come from an actual data lookup, not from the model's own estimation. The Root-Cause &amp; Action Agent, by contrast, is intentionally NOT tool-grounded, since its job is diagnostic reasoning over data it has already been given, not data retrieval.</w:t>
+      </w:r>
+    </w:p>
+    <w:p>
+      <w:pPr>
+        <w:pStyle w:val="Heading1"/>
+        <w:spacing w:after="160" w:before="320"/>
+      </w:pPr>
+      <w:r>
+        <w:t xml:space="preserve">7. A Simple Example</w:t>
+      </w:r>
+    </w:p>
+    <w:p>
+      <w:pPr>
+        <w:spacing w:after="160"/>
+      </w:pPr>
+      <w:r>
+        <w:t xml:space="preserve">To make this concrete, here is what happens to one shipment, in plain terms, with no technical jargon.</w:t>
+      </w:r>
+    </w:p>
+    <w:p>
+      <w:pPr>
+        <w:pStyle w:val="ListParagraph"/>
+        <w:numPr>
+          <w:ilvl w:val="0"/>
+          <w:numId w:val="2"/>
+        </w:numPr>
+        <w:spacing w:after="80"/>
+      </w:pPr>
+      <w:r>
+        <w:t xml:space="preserve">A refrigerated shipment of pharmaceutical stock is en route from Rotterdam to Warsaw. It is linked to a purchase order for a manufacturing customer whose production line depends on this delivery.</w:t>
+      </w:r>
+    </w:p>
+    <w:p>
+      <w:pPr>
+        <w:pStyle w:val="ListParagraph"/>
+        <w:numPr>
+          <w:ilvl w:val="0"/>
+          <w:numId w:val="2"/>
+        </w:numPr>
+        <w:spacing w:after="80"/>
+      </w:pPr>
+      <w:r>
+        <w:t xml:space="preserve">Partway through the journey, the shipment sits at customs far longer than expected, and the temperature log shows the cargo has crept above its safe limit.</w:t>
+      </w:r>
+    </w:p>
+    <w:p>
+      <w:pPr>
+        <w:pStyle w:val="ListParagraph"/>
+        <w:numPr>
+          <w:ilvl w:val="0"/>
+          <w:numId w:val="2"/>
+        </w:numPr>
+        <w:spacing w:after="80"/>
+      </w:pPr>
+      <w:r>
+        <w:t xml:space="preserve">The first agent notices both problems immediately — not at the end of the day when someone checks a spreadsheet, but as soon as the readings come in — and marks the shipment Critical.</w:t>
+      </w:r>
+    </w:p>
+    <w:p>
+      <w:pPr>
+        <w:pStyle w:val="ListParagraph"/>
+        <w:numPr>
+          <w:ilvl w:val="0"/>
+          <w:numId w:val="2"/>
+        </w:numPr>
+        <w:spacing w:after="80"/>
+      </w:pPr>
+      <w:r>
+        <w:t xml:space="preserve">The second agent looks at what went wrong and concludes: this looks like a customs hold combined with a refrigeration unit fault, and recommends contacting the carrier's dispatch team and flagging the cargo for inspection on arrival.</w:t>
+      </w:r>
+    </w:p>
+    <w:p>
+      <w:pPr>
+        <w:pStyle w:val="ListParagraph"/>
+        <w:numPr>
+          <w:ilvl w:val="0"/>
+          <w:numId w:val="2"/>
+        </w:numPr>
+        <w:spacing w:after="80"/>
+      </w:pPr>
+      <w:r>
+        <w:t xml:space="preserve">Because the shipment is Critical, the third agent then checks: which customer is this for, how much is the order worth, and does it feed a production line. It finds this order is tied to a €59,000 contract and that the customer's factory line depends on it — and raises this as an urgent case, not a routine one.</w:t>
+      </w:r>
+    </w:p>
+    <w:p>
+      <w:pPr>
+        <w:pStyle w:val="ListParagraph"/>
+        <w:numPr>
+          <w:ilvl w:val="0"/>
+          <w:numId w:val="2"/>
+        </w:numPr>
+        <w:spacing w:after="80"/>
+      </w:pPr>
+      <w:r>
+        <w:t xml:space="preserve">A human coordinator, instead of discovering this hours later buried in a routine status report, sees an immediate, prioritized alert: what happened, why, what to do, and how much is at stake — while there is still time to act.</w:t>
+      </w:r>
+    </w:p>
+    <w:p>
+      <w:pPr>
+        <w:spacing w:after="160"/>
+      </w:pPr>
+      <w:r>
+        <w:t xml:space="preserve">That is the entire system, end to end: notice quickly, explain why, and tell a human how much it matters — automatically, and only escalating the cases that genuinely need a person's judgment.</w:t>
+      </w:r>
+    </w:p>
+    <w:p>
+      <w:pPr>
+        <w:pStyle w:val="Heading1"/>
+        <w:spacing w:after="160" w:before="320"/>
+      </w:pPr>
+      <w:r>
+        <w:t xml:space="preserve">8. D365 Finance &amp; Operations / Retail Integration</w:t>
       </w:r>
     </w:p>
     <w:p>
@@ -889,7 +1457,7 @@
         <w:spacing w:after="160" w:before="320"/>
       </w:pPr>
       <w:r>
-        <w:t xml:space="preserve">5. Business Value</w:t>
+        <w:t xml:space="preserve">9. Business Value</w:t>
       </w:r>
     </w:p>
     <w:p>
@@ -958,7 +1526,7 @@
         <w:spacing w:after="160" w:before="320"/>
       </w:pPr>
       <w:r>
-        <w:t xml:space="preserve">6. Revenue Enhancement</w:t>
+        <w:t xml:space="preserve">10. Revenue Enhancement</w:t>
       </w:r>
     </w:p>
     <w:p>
@@ -1464,7 +2032,7 @@
         <w:spacing w:after="160" w:before="320"/>
       </w:pPr>
       <w:r>
-        <w:t xml:space="preserve">7. Audience</w:t>
+        <w:t xml:space="preserve">11. Audience</w:t>
       </w:r>
     </w:p>
     <w:p>
@@ -1503,7 +2071,7 @@
         <w:spacing w:after="80"/>
       </w:pPr>
       <w:r>
-        <w:t xml:space="preserve">Tertiary: Finance and procurement stakeholders, who are the audience for the revenue and cost-avoidance case in Section 6.</w:t>
+        <w:t xml:space="preserve">Tertiary: Finance and procurement stakeholders, who are the audience for the revenue and cost-avoidance case in Section 10.</w:t>
       </w:r>
     </w:p>
     <w:p>
@@ -1512,7 +2080,7 @@
         <w:spacing w:after="160" w:before="320"/>
       </w:pPr>
       <w:r>
-        <w:t xml:space="preserve">8. Plan → Design → Build → Validate</w:t>
+        <w:t xml:space="preserve">12. Plan → Design → Build → Validate</w:t>
       </w:r>
     </w:p>
     <w:tbl>
@@ -2061,7 +2629,7 @@
         <w:spacing w:after="160" w:before="320"/>
       </w:pPr>
       <w:r>
-        <w:t xml:space="preserve">9. Scope to Enhance This Solution</w:t>
+        <w:t xml:space="preserve">13. Scope to Enhance This Solution</w:t>
       </w:r>
     </w:p>
     <w:p>
@@ -2082,7 +2650,7 @@
         <w:spacing w:after="80"/>
       </w:pPr>
       <w:r>
-        <w:t xml:space="preserve">Live D365 F&amp;O integration: replace representative sample data with a live read-only OData connection against the entities mapped in Section 4, starting with a single legal entity and a small shipment subset.</w:t>
+        <w:t xml:space="preserve">Live D365 F&amp;O integration: replace representative sample data with a live read-only OData connection against the entities mapped in Section 8, starting with a single legal entity and a small shipment subset.</w:t>
       </w:r>
     </w:p>
     <w:p>

</xml_diff>